<commit_message>
refactor: restore and restructure traffic-optimizer (sumo orchestration, GA & reporting)
</commit_message>
<xml_diff>
--- a/documentation/docx/traffic_analysis_report.docx
+++ b/documentation/docx/traffic_analysis_report.docx
@@ -30,8 +30,1021 @@
         <w:t>- Sharp spikes or nonlinear increases typically indicate that the signal timing is no longer sufficient.</w:t>
         <w:br/>
         <w:t>- Comparing curves allows us to identify which scenarios scale best under heavier congestion.</w:t>
+        <w:br/>
+        <w:t>- The standard deviation of queue lengths across scenarios indicates stability:</w:t>
+        <w:br/>
+        <w:t xml:space="preserve">  - Lower standard deviation values suggest consistent performance.</w:t>
+        <w:br/>
+        <w:t xml:space="preserve">  - Higher standard deviation indicates more variability and potential instability in the signal plan.</w:t>
+        <w:br/>
+        <w:t>- Including the standard deviation in the table allows direct comparison of stability between signal plans.</w:t>
       </w:r>
     </w:p>
+    <w:tbl>
+      <w:tblPr>
+        <w:tblStyle w:val="LightGrid"/>
+        <w:tblW w:type="auto" w:w="0"/>
+        <w:tblLook w:firstColumn="1" w:firstRow="1" w:lastColumn="0" w:lastRow="0" w:noHBand="0" w:noVBand="1" w:val="04A0"/>
+      </w:tblPr>
+      <w:tblGrid>
+        <w:gridCol w:w="1440"/>
+        <w:gridCol w:w="1440"/>
+        <w:gridCol w:w="1440"/>
+        <w:gridCol w:w="1440"/>
+        <w:gridCol w:w="1440"/>
+        <w:gridCol w:w="1440"/>
+      </w:tblGrid>
+      <w:tr>
+        <w:tc>
+          <w:tcPr>
+            <w:tcW w:type="dxa" w:w="1440"/>
+          </w:tcPr>
+          <w:p>
+            <w:r>
+              <w:t>Scenario</w:t>
+            </w:r>
+          </w:p>
+        </w:tc>
+        <w:tc>
+          <w:tcPr>
+            <w:tcW w:type="dxa" w:w="1440"/>
+          </w:tcPr>
+          <w:p>
+            <w:r>
+              <w:t>Total Vehicles</w:t>
+            </w:r>
+          </w:p>
+        </w:tc>
+        <w:tc>
+          <w:tcPr>
+            <w:tcW w:type="dxa" w:w="1440"/>
+          </w:tcPr>
+          <w:p>
+            <w:r>
+              <w:t>ga_enhanced</w:t>
+            </w:r>
+          </w:p>
+        </w:tc>
+        <w:tc>
+          <w:tcPr>
+            <w:tcW w:type="dxa" w:w="1440"/>
+          </w:tcPr>
+          <w:p>
+            <w:r>
+              <w:t>original</w:t>
+            </w:r>
+          </w:p>
+        </w:tc>
+        <w:tc>
+          <w:tcPr>
+            <w:tcW w:type="dxa" w:w="1440"/>
+          </w:tcPr>
+          <w:p>
+            <w:r>
+              <w:t>pso</w:t>
+            </w:r>
+          </w:p>
+        </w:tc>
+        <w:tc>
+          <w:tcPr>
+            <w:tcW w:type="dxa" w:w="1440"/>
+          </w:tcPr>
+          <w:p>
+            <w:r>
+              <w:t>websters_baseline</w:t>
+            </w:r>
+          </w:p>
+        </w:tc>
+      </w:tr>
+      <w:tr>
+        <w:tc>
+          <w:tcPr>
+            <w:tcW w:type="dxa" w:w="1440"/>
+          </w:tcPr>
+          <w:p>
+            <w:r>
+              <w:t>Scenario 1</w:t>
+            </w:r>
+          </w:p>
+        </w:tc>
+        <w:tc>
+          <w:tcPr>
+            <w:tcW w:type="dxa" w:w="1440"/>
+          </w:tcPr>
+          <w:p>
+            <w:r>
+              <w:t>1392</w:t>
+            </w:r>
+          </w:p>
+        </w:tc>
+        <w:tc>
+          <w:tcPr>
+            <w:tcW w:type="dxa" w:w="1440"/>
+          </w:tcPr>
+          <w:p>
+            <w:r>
+              <w:t>0.3</w:t>
+            </w:r>
+          </w:p>
+        </w:tc>
+        <w:tc>
+          <w:tcPr>
+            <w:tcW w:type="dxa" w:w="1440"/>
+          </w:tcPr>
+          <w:p>
+            <w:r>
+              <w:t>1.2</w:t>
+            </w:r>
+          </w:p>
+        </w:tc>
+        <w:tc>
+          <w:tcPr>
+            <w:tcW w:type="dxa" w:w="1440"/>
+          </w:tcPr>
+          <w:p>
+            <w:r>
+              <w:t>0.9</w:t>
+            </w:r>
+          </w:p>
+        </w:tc>
+        <w:tc>
+          <w:tcPr>
+            <w:tcW w:type="dxa" w:w="1440"/>
+          </w:tcPr>
+          <w:p>
+            <w:r>
+              <w:t>0.3</w:t>
+            </w:r>
+          </w:p>
+        </w:tc>
+      </w:tr>
+      <w:tr>
+        <w:tc>
+          <w:tcPr>
+            <w:tcW w:type="dxa" w:w="1440"/>
+          </w:tcPr>
+          <w:p>
+            <w:r>
+              <w:t>Scenario 2</w:t>
+            </w:r>
+          </w:p>
+        </w:tc>
+        <w:tc>
+          <w:tcPr>
+            <w:tcW w:type="dxa" w:w="1440"/>
+          </w:tcPr>
+          <w:p>
+            <w:r>
+              <w:t>2031</w:t>
+            </w:r>
+          </w:p>
+        </w:tc>
+        <w:tc>
+          <w:tcPr>
+            <w:tcW w:type="dxa" w:w="1440"/>
+          </w:tcPr>
+          <w:p>
+            <w:r>
+              <w:t>0.5</w:t>
+            </w:r>
+          </w:p>
+        </w:tc>
+        <w:tc>
+          <w:tcPr>
+            <w:tcW w:type="dxa" w:w="1440"/>
+          </w:tcPr>
+          <w:p>
+            <w:r>
+              <w:t>1.8</w:t>
+            </w:r>
+          </w:p>
+        </w:tc>
+        <w:tc>
+          <w:tcPr>
+            <w:tcW w:type="dxa" w:w="1440"/>
+          </w:tcPr>
+          <w:p>
+            <w:r>
+              <w:t>1.5</w:t>
+            </w:r>
+          </w:p>
+        </w:tc>
+        <w:tc>
+          <w:tcPr>
+            <w:tcW w:type="dxa" w:w="1440"/>
+          </w:tcPr>
+          <w:p>
+            <w:r>
+              <w:t>0.5</w:t>
+            </w:r>
+          </w:p>
+        </w:tc>
+      </w:tr>
+      <w:tr>
+        <w:tc>
+          <w:tcPr>
+            <w:tcW w:type="dxa" w:w="1440"/>
+          </w:tcPr>
+          <w:p>
+            <w:r>
+              <w:t>Scenario 3</w:t>
+            </w:r>
+          </w:p>
+        </w:tc>
+        <w:tc>
+          <w:tcPr>
+            <w:tcW w:type="dxa" w:w="1440"/>
+          </w:tcPr>
+          <w:p>
+            <w:r>
+              <w:t>2186</w:t>
+            </w:r>
+          </w:p>
+        </w:tc>
+        <w:tc>
+          <w:tcPr>
+            <w:tcW w:type="dxa" w:w="1440"/>
+          </w:tcPr>
+          <w:p>
+            <w:r>
+              <w:t>0.6</w:t>
+            </w:r>
+          </w:p>
+        </w:tc>
+        <w:tc>
+          <w:tcPr>
+            <w:tcW w:type="dxa" w:w="1440"/>
+          </w:tcPr>
+          <w:p>
+            <w:r>
+              <w:t>2.3</w:t>
+            </w:r>
+          </w:p>
+        </w:tc>
+        <w:tc>
+          <w:tcPr>
+            <w:tcW w:type="dxa" w:w="1440"/>
+          </w:tcPr>
+          <w:p>
+            <w:r>
+              <w:t>1.7</w:t>
+            </w:r>
+          </w:p>
+        </w:tc>
+        <w:tc>
+          <w:tcPr>
+            <w:tcW w:type="dxa" w:w="1440"/>
+          </w:tcPr>
+          <w:p>
+            <w:r>
+              <w:t>0.6</w:t>
+            </w:r>
+          </w:p>
+        </w:tc>
+      </w:tr>
+      <w:tr>
+        <w:tc>
+          <w:tcPr>
+            <w:tcW w:type="dxa" w:w="1440"/>
+          </w:tcPr>
+          <w:p>
+            <w:r>
+              <w:t>Scenario 4</w:t>
+            </w:r>
+          </w:p>
+        </w:tc>
+        <w:tc>
+          <w:tcPr>
+            <w:tcW w:type="dxa" w:w="1440"/>
+          </w:tcPr>
+          <w:p>
+            <w:r>
+              <w:t>2252</w:t>
+            </w:r>
+          </w:p>
+        </w:tc>
+        <w:tc>
+          <w:tcPr>
+            <w:tcW w:type="dxa" w:w="1440"/>
+          </w:tcPr>
+          <w:p>
+            <w:r>
+              <w:t>0.6</w:t>
+            </w:r>
+          </w:p>
+        </w:tc>
+        <w:tc>
+          <w:tcPr>
+            <w:tcW w:type="dxa" w:w="1440"/>
+          </w:tcPr>
+          <w:p>
+            <w:r>
+              <w:t>2.4</w:t>
+            </w:r>
+          </w:p>
+        </w:tc>
+        <w:tc>
+          <w:tcPr>
+            <w:tcW w:type="dxa" w:w="1440"/>
+          </w:tcPr>
+          <w:p>
+            <w:r>
+              <w:t>1.9</w:t>
+            </w:r>
+          </w:p>
+        </w:tc>
+        <w:tc>
+          <w:tcPr>
+            <w:tcW w:type="dxa" w:w="1440"/>
+          </w:tcPr>
+          <w:p>
+            <w:r>
+              <w:t>0.7</w:t>
+            </w:r>
+          </w:p>
+        </w:tc>
+      </w:tr>
+      <w:tr>
+        <w:tc>
+          <w:tcPr>
+            <w:tcW w:type="dxa" w:w="1440"/>
+          </w:tcPr>
+          <w:p>
+            <w:r>
+              <w:t>Scenario 5</w:t>
+            </w:r>
+          </w:p>
+        </w:tc>
+        <w:tc>
+          <w:tcPr>
+            <w:tcW w:type="dxa" w:w="1440"/>
+          </w:tcPr>
+          <w:p>
+            <w:r>
+              <w:t>2256</w:t>
+            </w:r>
+          </w:p>
+        </w:tc>
+        <w:tc>
+          <w:tcPr>
+            <w:tcW w:type="dxa" w:w="1440"/>
+          </w:tcPr>
+          <w:p>
+            <w:r>
+              <w:t>0.6</w:t>
+            </w:r>
+          </w:p>
+        </w:tc>
+        <w:tc>
+          <w:tcPr>
+            <w:tcW w:type="dxa" w:w="1440"/>
+          </w:tcPr>
+          <w:p>
+            <w:r>
+              <w:t>2.3</w:t>
+            </w:r>
+          </w:p>
+        </w:tc>
+        <w:tc>
+          <w:tcPr>
+            <w:tcW w:type="dxa" w:w="1440"/>
+          </w:tcPr>
+          <w:p>
+            <w:r>
+              <w:t>1.8</w:t>
+            </w:r>
+          </w:p>
+        </w:tc>
+        <w:tc>
+          <w:tcPr>
+            <w:tcW w:type="dxa" w:w="1440"/>
+          </w:tcPr>
+          <w:p>
+            <w:r>
+              <w:t>0.7</w:t>
+            </w:r>
+          </w:p>
+        </w:tc>
+      </w:tr>
+      <w:tr>
+        <w:tc>
+          <w:tcPr>
+            <w:tcW w:type="dxa" w:w="1440"/>
+          </w:tcPr>
+          <w:p>
+            <w:r>
+              <w:t>Scenario 6</w:t>
+            </w:r>
+          </w:p>
+        </w:tc>
+        <w:tc>
+          <w:tcPr>
+            <w:tcW w:type="dxa" w:w="1440"/>
+          </w:tcPr>
+          <w:p>
+            <w:r>
+              <w:t>2331</w:t>
+            </w:r>
+          </w:p>
+        </w:tc>
+        <w:tc>
+          <w:tcPr>
+            <w:tcW w:type="dxa" w:w="1440"/>
+          </w:tcPr>
+          <w:p>
+            <w:r>
+              <w:t>0.6</w:t>
+            </w:r>
+          </w:p>
+        </w:tc>
+        <w:tc>
+          <w:tcPr>
+            <w:tcW w:type="dxa" w:w="1440"/>
+          </w:tcPr>
+          <w:p>
+            <w:r>
+              <w:t>2.4</w:t>
+            </w:r>
+          </w:p>
+        </w:tc>
+        <w:tc>
+          <w:tcPr>
+            <w:tcW w:type="dxa" w:w="1440"/>
+          </w:tcPr>
+          <w:p>
+            <w:r>
+              <w:t>1.9</w:t>
+            </w:r>
+          </w:p>
+        </w:tc>
+        <w:tc>
+          <w:tcPr>
+            <w:tcW w:type="dxa" w:w="1440"/>
+          </w:tcPr>
+          <w:p>
+            <w:r>
+              <w:t>0.7</w:t>
+            </w:r>
+          </w:p>
+        </w:tc>
+      </w:tr>
+      <w:tr>
+        <w:tc>
+          <w:tcPr>
+            <w:tcW w:type="dxa" w:w="1440"/>
+          </w:tcPr>
+          <w:p>
+            <w:r>
+              <w:t>Scenario 7</w:t>
+            </w:r>
+          </w:p>
+        </w:tc>
+        <w:tc>
+          <w:tcPr>
+            <w:tcW w:type="dxa" w:w="1440"/>
+          </w:tcPr>
+          <w:p>
+            <w:r>
+              <w:t>2335</w:t>
+            </w:r>
+          </w:p>
+        </w:tc>
+        <w:tc>
+          <w:tcPr>
+            <w:tcW w:type="dxa" w:w="1440"/>
+          </w:tcPr>
+          <w:p>
+            <w:r>
+              <w:t>0.6</w:t>
+            </w:r>
+          </w:p>
+        </w:tc>
+        <w:tc>
+          <w:tcPr>
+            <w:tcW w:type="dxa" w:w="1440"/>
+          </w:tcPr>
+          <w:p>
+            <w:r>
+              <w:t>2.4</w:t>
+            </w:r>
+          </w:p>
+        </w:tc>
+        <w:tc>
+          <w:tcPr>
+            <w:tcW w:type="dxa" w:w="1440"/>
+          </w:tcPr>
+          <w:p>
+            <w:r>
+              <w:t>1.9</w:t>
+            </w:r>
+          </w:p>
+        </w:tc>
+        <w:tc>
+          <w:tcPr>
+            <w:tcW w:type="dxa" w:w="1440"/>
+          </w:tcPr>
+          <w:p>
+            <w:r>
+              <w:t>0.7</w:t>
+            </w:r>
+          </w:p>
+        </w:tc>
+      </w:tr>
+      <w:tr>
+        <w:tc>
+          <w:tcPr>
+            <w:tcW w:type="dxa" w:w="1440"/>
+          </w:tcPr>
+          <w:p>
+            <w:r>
+              <w:t>Scenario 8</w:t>
+            </w:r>
+          </w:p>
+        </w:tc>
+        <w:tc>
+          <w:tcPr>
+            <w:tcW w:type="dxa" w:w="1440"/>
+          </w:tcPr>
+          <w:p>
+            <w:r>
+              <w:t>2342</w:t>
+            </w:r>
+          </w:p>
+        </w:tc>
+        <w:tc>
+          <w:tcPr>
+            <w:tcW w:type="dxa" w:w="1440"/>
+          </w:tcPr>
+          <w:p>
+            <w:r>
+              <w:t>0.7</w:t>
+            </w:r>
+          </w:p>
+        </w:tc>
+        <w:tc>
+          <w:tcPr>
+            <w:tcW w:type="dxa" w:w="1440"/>
+          </w:tcPr>
+          <w:p>
+            <w:r>
+              <w:t>2.5</w:t>
+            </w:r>
+          </w:p>
+        </w:tc>
+        <w:tc>
+          <w:tcPr>
+            <w:tcW w:type="dxa" w:w="1440"/>
+          </w:tcPr>
+          <w:p>
+            <w:r>
+              <w:t>2.0</w:t>
+            </w:r>
+          </w:p>
+        </w:tc>
+        <w:tc>
+          <w:tcPr>
+            <w:tcW w:type="dxa" w:w="1440"/>
+          </w:tcPr>
+          <w:p>
+            <w:r>
+              <w:t>0.7</w:t>
+            </w:r>
+          </w:p>
+        </w:tc>
+      </w:tr>
+      <w:tr>
+        <w:tc>
+          <w:tcPr>
+            <w:tcW w:type="dxa" w:w="1440"/>
+          </w:tcPr>
+          <w:p>
+            <w:r>
+              <w:t>Scenario 9</w:t>
+            </w:r>
+          </w:p>
+        </w:tc>
+        <w:tc>
+          <w:tcPr>
+            <w:tcW w:type="dxa" w:w="1440"/>
+          </w:tcPr>
+          <w:p>
+            <w:r>
+              <w:t>2508</w:t>
+            </w:r>
+          </w:p>
+        </w:tc>
+        <w:tc>
+          <w:tcPr>
+            <w:tcW w:type="dxa" w:w="1440"/>
+          </w:tcPr>
+          <w:p>
+            <w:r>
+              <w:t>0.6</w:t>
+            </w:r>
+          </w:p>
+        </w:tc>
+        <w:tc>
+          <w:tcPr>
+            <w:tcW w:type="dxa" w:w="1440"/>
+          </w:tcPr>
+          <w:p>
+            <w:r>
+              <w:t>2.3</w:t>
+            </w:r>
+          </w:p>
+        </w:tc>
+        <w:tc>
+          <w:tcPr>
+            <w:tcW w:type="dxa" w:w="1440"/>
+          </w:tcPr>
+          <w:p>
+            <w:r>
+              <w:t>1.8</w:t>
+            </w:r>
+          </w:p>
+        </w:tc>
+        <w:tc>
+          <w:tcPr>
+            <w:tcW w:type="dxa" w:w="1440"/>
+          </w:tcPr>
+          <w:p>
+            <w:r>
+              <w:t>0.7</w:t>
+            </w:r>
+          </w:p>
+        </w:tc>
+      </w:tr>
+      <w:tr>
+        <w:tc>
+          <w:tcPr>
+            <w:tcW w:type="dxa" w:w="1440"/>
+          </w:tcPr>
+          <w:p>
+            <w:r>
+              <w:t>Scenario 10</w:t>
+            </w:r>
+          </w:p>
+        </w:tc>
+        <w:tc>
+          <w:tcPr>
+            <w:tcW w:type="dxa" w:w="1440"/>
+          </w:tcPr>
+          <w:p>
+            <w:r>
+              <w:t>2543</w:t>
+            </w:r>
+          </w:p>
+        </w:tc>
+        <w:tc>
+          <w:tcPr>
+            <w:tcW w:type="dxa" w:w="1440"/>
+          </w:tcPr>
+          <w:p>
+            <w:r>
+              <w:t>2.0</w:t>
+            </w:r>
+          </w:p>
+        </w:tc>
+        <w:tc>
+          <w:tcPr>
+            <w:tcW w:type="dxa" w:w="1440"/>
+          </w:tcPr>
+          <w:p>
+            <w:r>
+              <w:t>6.3</w:t>
+            </w:r>
+          </w:p>
+        </w:tc>
+        <w:tc>
+          <w:tcPr>
+            <w:tcW w:type="dxa" w:w="1440"/>
+          </w:tcPr>
+          <w:p>
+            <w:r>
+              <w:t>2.2</w:t>
+            </w:r>
+          </w:p>
+        </w:tc>
+        <w:tc>
+          <w:tcPr>
+            <w:tcW w:type="dxa" w:w="1440"/>
+          </w:tcPr>
+          <w:p>
+            <w:r>
+              <w:t>0.8</w:t>
+            </w:r>
+          </w:p>
+        </w:tc>
+      </w:tr>
+      <w:tr>
+        <w:tc>
+          <w:tcPr>
+            <w:tcW w:type="dxa" w:w="1440"/>
+          </w:tcPr>
+          <w:p>
+            <w:r>
+              <w:t>Scenario 11</w:t>
+            </w:r>
+          </w:p>
+        </w:tc>
+        <w:tc>
+          <w:tcPr>
+            <w:tcW w:type="dxa" w:w="1440"/>
+          </w:tcPr>
+          <w:p>
+            <w:r>
+              <w:t>2657</w:t>
+            </w:r>
+          </w:p>
+        </w:tc>
+        <w:tc>
+          <w:tcPr>
+            <w:tcW w:type="dxa" w:w="1440"/>
+          </w:tcPr>
+          <w:p>
+            <w:r>
+              <w:t>1.0</w:t>
+            </w:r>
+          </w:p>
+        </w:tc>
+        <w:tc>
+          <w:tcPr>
+            <w:tcW w:type="dxa" w:w="1440"/>
+          </w:tcPr>
+          <w:p>
+            <w:r>
+              <w:t>3.0</w:t>
+            </w:r>
+          </w:p>
+        </w:tc>
+        <w:tc>
+          <w:tcPr>
+            <w:tcW w:type="dxa" w:w="1440"/>
+          </w:tcPr>
+          <w:p>
+            <w:r>
+              <w:t>5.8</w:t>
+            </w:r>
+          </w:p>
+        </w:tc>
+        <w:tc>
+          <w:tcPr>
+            <w:tcW w:type="dxa" w:w="1440"/>
+          </w:tcPr>
+          <w:p>
+            <w:r>
+              <w:t>0.9</w:t>
+            </w:r>
+          </w:p>
+        </w:tc>
+      </w:tr>
+      <w:tr>
+        <w:tc>
+          <w:tcPr>
+            <w:tcW w:type="dxa" w:w="1440"/>
+          </w:tcPr>
+          <w:p>
+            <w:r>
+              <w:t>Scenario 12</w:t>
+            </w:r>
+          </w:p>
+        </w:tc>
+        <w:tc>
+          <w:tcPr>
+            <w:tcW w:type="dxa" w:w="1440"/>
+          </w:tcPr>
+          <w:p>
+            <w:r>
+              <w:t>3094</w:t>
+            </w:r>
+          </w:p>
+        </w:tc>
+        <w:tc>
+          <w:tcPr>
+            <w:tcW w:type="dxa" w:w="1440"/>
+          </w:tcPr>
+          <w:p>
+            <w:r>
+              <w:t>4.4</w:t>
+            </w:r>
+          </w:p>
+        </w:tc>
+        <w:tc>
+          <w:tcPr>
+            <w:tcW w:type="dxa" w:w="1440"/>
+          </w:tcPr>
+          <w:p>
+            <w:r>
+              <w:t>7.7</w:t>
+            </w:r>
+          </w:p>
+        </w:tc>
+        <w:tc>
+          <w:tcPr>
+            <w:tcW w:type="dxa" w:w="1440"/>
+          </w:tcPr>
+          <w:p>
+            <w:r>
+              <w:t>8.0</w:t>
+            </w:r>
+          </w:p>
+        </w:tc>
+        <w:tc>
+          <w:tcPr>
+            <w:tcW w:type="dxa" w:w="1440"/>
+          </w:tcPr>
+          <w:p>
+            <w:r>
+              <w:t>1.7</w:t>
+            </w:r>
+          </w:p>
+        </w:tc>
+      </w:tr>
+      <w:tr>
+        <w:tc>
+          <w:tcPr>
+            <w:tcW w:type="dxa" w:w="1440"/>
+          </w:tcPr>
+          <w:p>
+            <w:r>
+              <w:t>Scenario 13</w:t>
+            </w:r>
+          </w:p>
+        </w:tc>
+        <w:tc>
+          <w:tcPr>
+            <w:tcW w:type="dxa" w:w="1440"/>
+          </w:tcPr>
+          <w:p>
+            <w:r>
+              <w:t>3171</w:t>
+            </w:r>
+          </w:p>
+        </w:tc>
+        <w:tc>
+          <w:tcPr>
+            <w:tcW w:type="dxa" w:w="1440"/>
+          </w:tcPr>
+          <w:p>
+            <w:r>
+              <w:t>0.8</w:t>
+            </w:r>
+          </w:p>
+        </w:tc>
+        <w:tc>
+          <w:tcPr>
+            <w:tcW w:type="dxa" w:w="1440"/>
+          </w:tcPr>
+          <w:p>
+            <w:r>
+              <w:t>2.9</w:t>
+            </w:r>
+          </w:p>
+        </w:tc>
+        <w:tc>
+          <w:tcPr>
+            <w:tcW w:type="dxa" w:w="1440"/>
+          </w:tcPr>
+          <w:p>
+            <w:r>
+              <w:t>2.2</w:t>
+            </w:r>
+          </w:p>
+        </w:tc>
+        <w:tc>
+          <w:tcPr>
+            <w:tcW w:type="dxa" w:w="1440"/>
+          </w:tcPr>
+          <w:p>
+            <w:r>
+              <w:t>0.8</w:t>
+            </w:r>
+          </w:p>
+        </w:tc>
+      </w:tr>
+      <w:tr>
+        <w:tc>
+          <w:tcPr>
+            <w:tcW w:type="dxa" w:w="1440"/>
+          </w:tcPr>
+          <w:p>
+            <w:r>
+              <w:t>Scenario 14</w:t>
+            </w:r>
+          </w:p>
+        </w:tc>
+        <w:tc>
+          <w:tcPr>
+            <w:tcW w:type="dxa" w:w="1440"/>
+          </w:tcPr>
+          <w:p>
+            <w:r>
+              <w:t>3509</w:t>
+            </w:r>
+          </w:p>
+        </w:tc>
+        <w:tc>
+          <w:tcPr>
+            <w:tcW w:type="dxa" w:w="1440"/>
+          </w:tcPr>
+          <w:p>
+            <w:r>
+              <w:t>7.0</w:t>
+            </w:r>
+          </w:p>
+        </w:tc>
+        <w:tc>
+          <w:tcPr>
+            <w:tcW w:type="dxa" w:w="1440"/>
+          </w:tcPr>
+          <w:p>
+            <w:r>
+              <w:t>7.9</w:t>
+            </w:r>
+          </w:p>
+        </w:tc>
+        <w:tc>
+          <w:tcPr>
+            <w:tcW w:type="dxa" w:w="1440"/>
+          </w:tcPr>
+          <w:p>
+            <w:r>
+              <w:t>9.6</w:t>
+            </w:r>
+          </w:p>
+        </w:tc>
+        <w:tc>
+          <w:tcPr>
+            <w:tcW w:type="dxa" w:w="1440"/>
+          </w:tcPr>
+          <w:p>
+            <w:r>
+              <w:t>3.9</w:t>
+            </w:r>
+          </w:p>
+        </w:tc>
+      </w:tr>
+      <w:tr>
+        <w:tc>
+          <w:tcPr>
+            <w:tcW w:type="dxa" w:w="1440"/>
+          </w:tcPr>
+          <w:p>
+            <w:r>
+              <w:t>Coefficient of Variation</w:t>
+            </w:r>
+          </w:p>
+        </w:tc>
+        <w:tc>
+          <w:tcPr>
+            <w:tcW w:type="dxa" w:w="1440"/>
+          </w:tcPr>
+          <w:p>
+            <w:r/>
+          </w:p>
+        </w:tc>
+        <w:tc>
+          <w:tcPr>
+            <w:tcW w:type="dxa" w:w="1440"/>
+          </w:tcPr>
+          <w:p>
+            <w:r>
+              <w:t>1.27</w:t>
+            </w:r>
+          </w:p>
+        </w:tc>
+        <w:tc>
+          <w:tcPr>
+            <w:tcW w:type="dxa" w:w="1440"/>
+          </w:tcPr>
+          <w:p>
+            <w:r>
+              <w:t>0.63</w:t>
+            </w:r>
+          </w:p>
+        </w:tc>
+        <w:tc>
+          <w:tcPr>
+            <w:tcW w:type="dxa" w:w="1440"/>
+          </w:tcPr>
+          <w:p>
+            <w:r>
+              <w:t>0.84</w:t>
+            </w:r>
+          </w:p>
+        </w:tc>
+        <w:tc>
+          <w:tcPr>
+            <w:tcW w:type="dxa" w:w="1440"/>
+          </w:tcPr>
+          <w:p>
+            <w:r>
+              <w:t>0.87</w:t>
+            </w:r>
+          </w:p>
+        </w:tc>
+      </w:tr>
+    </w:tbl>
     <w:p>
       <w:r>
         <w:drawing>
@@ -105,6 +1118,278 @@
         <w:t>- These charts help identify which signal plan provides the best overall efficiency.</w:t>
       </w:r>
     </w:p>
+    <w:tbl>
+      <w:tblPr>
+        <w:tblStyle w:val="LightGrid"/>
+        <w:tblW w:type="auto" w:w="0"/>
+        <w:tblLook w:firstColumn="1" w:firstRow="1" w:lastColumn="0" w:lastRow="0" w:noHBand="0" w:noVBand="1" w:val="04A0"/>
+      </w:tblPr>
+      <w:tblGrid>
+        <w:gridCol w:w="1728"/>
+        <w:gridCol w:w="1728"/>
+        <w:gridCol w:w="1728"/>
+        <w:gridCol w:w="1728"/>
+        <w:gridCol w:w="1728"/>
+      </w:tblGrid>
+      <w:tr>
+        <w:tc>
+          <w:tcPr>
+            <w:tcW w:type="dxa" w:w="1728"/>
+          </w:tcPr>
+          <w:p>
+            <w:r/>
+          </w:p>
+        </w:tc>
+        <w:tc>
+          <w:tcPr>
+            <w:tcW w:type="dxa" w:w="1728"/>
+          </w:tcPr>
+          <w:p>
+            <w:r>
+              <w:t>ORIGINAL CONFIG</w:t>
+            </w:r>
+          </w:p>
+        </w:tc>
+        <w:tc>
+          <w:tcPr>
+            <w:tcW w:type="dxa" w:w="1728"/>
+          </w:tcPr>
+          <w:p>
+            <w:r>
+              <w:t>PSO</w:t>
+            </w:r>
+          </w:p>
+        </w:tc>
+        <w:tc>
+          <w:tcPr>
+            <w:tcW w:type="dxa" w:w="1728"/>
+          </w:tcPr>
+          <w:p>
+            <w:r>
+              <w:t>WEBSTER BASELINE</w:t>
+            </w:r>
+          </w:p>
+        </w:tc>
+        <w:tc>
+          <w:tcPr>
+            <w:tcW w:type="dxa" w:w="1728"/>
+          </w:tcPr>
+          <w:p>
+            <w:r>
+              <w:t>GA ENHANCED</w:t>
+            </w:r>
+          </w:p>
+        </w:tc>
+      </w:tr>
+      <w:tr>
+        <w:tc>
+          <w:tcPr>
+            <w:tcW w:type="dxa" w:w="1728"/>
+          </w:tcPr>
+          <w:p>
+            <w:r>
+              <w:t>Average Delay Time (s)</w:t>
+            </w:r>
+          </w:p>
+        </w:tc>
+        <w:tc>
+          <w:tcPr>
+            <w:tcW w:type="dxa" w:w="1728"/>
+          </w:tcPr>
+          <w:p>
+            <w:r>
+              <w:t>33.0</w:t>
+            </w:r>
+          </w:p>
+        </w:tc>
+        <w:tc>
+          <w:tcPr>
+            <w:tcW w:type="dxa" w:w="1728"/>
+          </w:tcPr>
+          <w:p>
+            <w:r>
+              <w:t>27.9</w:t>
+            </w:r>
+          </w:p>
+        </w:tc>
+        <w:tc>
+          <w:tcPr>
+            <w:tcW w:type="dxa" w:w="1728"/>
+          </w:tcPr>
+          <w:p>
+            <w:r>
+              <w:t>15.5</w:t>
+            </w:r>
+          </w:p>
+        </w:tc>
+        <w:tc>
+          <w:tcPr>
+            <w:tcW w:type="dxa" w:w="1728"/>
+          </w:tcPr>
+          <w:p>
+            <w:r>
+              <w:t>15.0</w:t>
+            </w:r>
+          </w:p>
+        </w:tc>
+      </w:tr>
+      <w:tr>
+        <w:tc>
+          <w:tcPr>
+            <w:tcW w:type="dxa" w:w="1728"/>
+          </w:tcPr>
+          <w:p>
+            <w:r>
+              <w:t>Average Waiting Time (s)</w:t>
+            </w:r>
+          </w:p>
+        </w:tc>
+        <w:tc>
+          <w:tcPr>
+            <w:tcW w:type="dxa" w:w="1728"/>
+          </w:tcPr>
+          <w:p>
+            <w:r>
+              <w:t>22.2</w:t>
+            </w:r>
+          </w:p>
+        </w:tc>
+        <w:tc>
+          <w:tcPr>
+            <w:tcW w:type="dxa" w:w="1728"/>
+          </w:tcPr>
+          <w:p>
+            <w:r>
+              <w:t>17.3</w:t>
+            </w:r>
+          </w:p>
+        </w:tc>
+        <w:tc>
+          <w:tcPr>
+            <w:tcW w:type="dxa" w:w="1728"/>
+          </w:tcPr>
+          <w:p>
+            <w:r>
+              <w:t>6.3</w:t>
+            </w:r>
+          </w:p>
+        </w:tc>
+        <w:tc>
+          <w:tcPr>
+            <w:tcW w:type="dxa" w:w="1728"/>
+          </w:tcPr>
+          <w:p>
+            <w:r>
+              <w:t>5.6</w:t>
+            </w:r>
+          </w:p>
+        </w:tc>
+      </w:tr>
+      <w:tr>
+        <w:tc>
+          <w:tcPr>
+            <w:tcW w:type="dxa" w:w="1728"/>
+          </w:tcPr>
+          <w:p>
+            <w:r>
+              <w:t>Average Stops</w:t>
+            </w:r>
+          </w:p>
+        </w:tc>
+        <w:tc>
+          <w:tcPr>
+            <w:tcW w:type="dxa" w:w="1728"/>
+          </w:tcPr>
+          <w:p>
+            <w:r>
+              <w:t>0.6</w:t>
+            </w:r>
+          </w:p>
+        </w:tc>
+        <w:tc>
+          <w:tcPr>
+            <w:tcW w:type="dxa" w:w="1728"/>
+          </w:tcPr>
+          <w:p>
+            <w:r>
+              <w:t>0.6</w:t>
+            </w:r>
+          </w:p>
+        </w:tc>
+        <w:tc>
+          <w:tcPr>
+            <w:tcW w:type="dxa" w:w="1728"/>
+          </w:tcPr>
+          <w:p>
+            <w:r>
+              <w:t>0.5</w:t>
+            </w:r>
+          </w:p>
+        </w:tc>
+        <w:tc>
+          <w:tcPr>
+            <w:tcW w:type="dxa" w:w="1728"/>
+          </w:tcPr>
+          <w:p>
+            <w:r>
+              <w:t>0.5</w:t>
+            </w:r>
+          </w:p>
+        </w:tc>
+      </w:tr>
+      <w:tr>
+        <w:tc>
+          <w:tcPr>
+            <w:tcW w:type="dxa" w:w="1728"/>
+          </w:tcPr>
+          <w:p>
+            <w:r>
+              <w:t>Average Travel Time (s)</w:t>
+            </w:r>
+          </w:p>
+        </w:tc>
+        <w:tc>
+          <w:tcPr>
+            <w:tcW w:type="dxa" w:w="1728"/>
+          </w:tcPr>
+          <w:p>
+            <w:r>
+              <w:t>67.2</w:t>
+            </w:r>
+          </w:p>
+        </w:tc>
+        <w:tc>
+          <w:tcPr>
+            <w:tcW w:type="dxa" w:w="1728"/>
+          </w:tcPr>
+          <w:p>
+            <w:r>
+              <w:t>62.0</w:t>
+            </w:r>
+          </w:p>
+        </w:tc>
+        <w:tc>
+          <w:tcPr>
+            <w:tcW w:type="dxa" w:w="1728"/>
+          </w:tcPr>
+          <w:p>
+            <w:r>
+              <w:t>49.6</w:t>
+            </w:r>
+          </w:p>
+        </w:tc>
+        <w:tc>
+          <w:tcPr>
+            <w:tcW w:type="dxa" w:w="1728"/>
+          </w:tcPr>
+          <w:p>
+            <w:r>
+              <w:t>49.1</w:t>
+            </w:r>
+          </w:p>
+        </w:tc>
+      </w:tr>
+    </w:tbl>
     <w:p>
       <w:r>
         <w:drawing>

</xml_diff>